<commit_message>
docs: add AI chat screenshots to the report
</commit_message>
<xml_diff>
--- a/docs/report/ЛР1_Заяць_ІПЗ-1.docx
+++ b/docs/report/ЛР1_Заяць_ІПЗ-1.docx
@@ -13207,125 +13207,56 @@
         <w:t xml:space="preserve"> наведено на рисунках 1.17–1.20.</w:t>
       </w:r>
     </w:p>
-    <w:tbl>
-      <w:tblPr>
-        <w:tblW w:type="dxa" w:w="9354"/>
-        <w:tblBorders>
-          <w:top w:val="single" w:color="auto" w:sz="4"/>
-          <w:left w:val="single" w:color="auto" w:sz="4"/>
-          <w:bottom w:val="single" w:color="auto" w:sz="4"/>
-          <w:right w:val="single" w:color="auto" w:sz="4"/>
-          <w:insideH w:val="single" w:color="auto" w:sz="4"/>
-          <w:insideV w:val="single" w:color="auto" w:sz="4"/>
-        </w:tblBorders>
-      </w:tblPr>
-      <w:tblGrid>
-        <w:gridCol w:w="9354"/>
-      </w:tblGrid>
-      <w:tr>
-        <w:tc>
-          <w:tcPr>
-            <w:tcW w:type="dxa" w:w="9354"/>
-            <w:tcBorders>
-              <w:top w:val="dashed" w:color="888888" w:sz="6"/>
-              <w:left w:val="dashed" w:color="888888" w:sz="6"/>
-              <w:bottom w:val="dashed" w:color="888888" w:sz="6"/>
-              <w:right w:val="dashed" w:color="888888" w:sz="6"/>
-            </w:tcBorders>
-            <w:tcMar>
-              <w:top w:type="dxa" w:w="600"/>
-              <w:left w:type="dxa" w:w="200"/>
-              <w:bottom w:type="dxa" w:w="600"/>
-              <w:right w:type="dxa" w:w="200"/>
-            </w:tcMar>
-          </w:tcPr>
-          <w:p>
-            <w:pPr>
-              <w:jc w:val="center"/>
-            </w:pPr>
-            <w:r>
-              <w:rPr>
-                <w:rFonts w:ascii="Times New Roman" w:cs="Times New Roman" w:eastAsia="Times New Roman" w:hAnsi="Times New Roman"/>
-                <w:i/>
-                <w:iCs/>
-                <w:color w:val="666666"/>
-                <w:sz w:val="24"/>
-                <w:szCs w:val="24"/>
-              </w:rPr>
-              <w:t xml:space="preserve">Місце для скріншоту: відповідь на промпт 1 – ТЗ</w:t>
-            </w:r>
-          </w:p>
-        </w:tc>
-      </w:tr>
-    </w:tbl>
     <w:p>
       <w:pPr>
-        <w:spacing w:after="160" w:before="60" w:line="276"/>
+        <w:keepNext/>
+        <w:spacing w:after="60" w:before="120"/>
         <w:jc w:val="center"/>
       </w:pPr>
       <w:r>
-        <w:rPr>
-          <w:rFonts w:ascii="Times New Roman" w:cs="Times New Roman" w:eastAsia="Times New Roman" w:hAnsi="Times New Roman"/>
-          <w:sz w:val="28"/>
-          <w:szCs w:val="28"/>
-        </w:rPr>
-        <w:t xml:space="preserve">Рисунок 1.17 – Діалог з AI: технічне завдання (промпт 1)</w:t>
+        <w:drawing>
+          <wp:inline distT="0" distB="0" distL="0" distR="0">
+            <wp:extent cx="5905500" cy="3057525"/>
+            <wp:effectExtent t="0" r="0" b="0" l="0"/>
+            <wp:docPr id="17" name="" descr="" title=""/>
+            <wp:cNvGraphicFramePr>
+              <a:graphicFrameLocks xmlns:a="http://schemas.openxmlformats.org/drawingml/2006/main" noChangeAspect="1"/>
+            </wp:cNvGraphicFramePr>
+            <a:graphic xmlns:a="http://schemas.openxmlformats.org/drawingml/2006/main">
+              <a:graphicData uri="http://schemas.openxmlformats.org/drawingml/2006/picture">
+                <pic:pic xmlns:pic="http://schemas.openxmlformats.org/drawingml/2006/picture">
+                  <pic:nvPicPr>
+                    <pic:cNvPr id="0" name="" descr=""/>
+                    <pic:cNvPicPr>
+                      <a:picLocks noChangeAspect="1" noChangeArrowheads="1"/>
+                    </pic:cNvPicPr>
+                  </pic:nvPicPr>
+                  <pic:blipFill>
+                    <a:blip r:embed="rId25" cstate="none"/>
+                    <a:srcRect/>
+                    <a:stretch>
+                      <a:fillRect/>
+                    </a:stretch>
+                  </pic:blipFill>
+                  <pic:spPr bwMode="auto">
+                    <a:xfrm>
+                      <a:off x="0" y="0"/>
+                      <a:ext cx="5905500" cy="3057525"/>
+                    </a:xfrm>
+                    <a:prstGeom prst="rect">
+                      <a:avLst/>
+                    </a:prstGeom>
+                  </pic:spPr>
+                </pic:pic>
+              </a:graphicData>
+            </a:graphic>
+          </wp:inline>
+        </w:drawing>
       </w:r>
     </w:p>
-    <w:tbl>
-      <w:tblPr>
-        <w:tblW w:type="dxa" w:w="9354"/>
-        <w:tblBorders>
-          <w:top w:val="single" w:color="auto" w:sz="4"/>
-          <w:left w:val="single" w:color="auto" w:sz="4"/>
-          <w:bottom w:val="single" w:color="auto" w:sz="4"/>
-          <w:right w:val="single" w:color="auto" w:sz="4"/>
-          <w:insideH w:val="single" w:color="auto" w:sz="4"/>
-          <w:insideV w:val="single" w:color="auto" w:sz="4"/>
-        </w:tblBorders>
-      </w:tblPr>
-      <w:tblGrid>
-        <w:gridCol w:w="9354"/>
-      </w:tblGrid>
-      <w:tr>
-        <w:tc>
-          <w:tcPr>
-            <w:tcW w:type="dxa" w:w="9354"/>
-            <w:tcBorders>
-              <w:top w:val="dashed" w:color="888888" w:sz="6"/>
-              <w:left w:val="dashed" w:color="888888" w:sz="6"/>
-              <w:bottom w:val="dashed" w:color="888888" w:sz="6"/>
-              <w:right w:val="dashed" w:color="888888" w:sz="6"/>
-            </w:tcBorders>
-            <w:tcMar>
-              <w:top w:type="dxa" w:w="600"/>
-              <w:left w:type="dxa" w:w="200"/>
-              <w:bottom w:type="dxa" w:w="600"/>
-              <w:right w:type="dxa" w:w="200"/>
-            </w:tcMar>
-          </w:tcPr>
-          <w:p>
-            <w:pPr>
-              <w:jc w:val="center"/>
-            </w:pPr>
-            <w:r>
-              <w:rPr>
-                <w:rFonts w:ascii="Times New Roman" w:cs="Times New Roman" w:eastAsia="Times New Roman" w:hAnsi="Times New Roman"/>
-                <w:i/>
-                <w:iCs/>
-                <w:color w:val="666666"/>
-                <w:sz w:val="24"/>
-                <w:szCs w:val="24"/>
-              </w:rPr>
-              <w:t xml:space="preserve">Місце для скріншоту: відповідь на промпт 6 – МНК</w:t>
-            </w:r>
-          </w:p>
-        </w:tc>
-      </w:tr>
-    </w:tbl>
     <w:p>
       <w:pPr>
-        <w:spacing w:after="160" w:before="60" w:line="276"/>
+        <w:spacing w:after="160" w:line="276"/>
         <w:jc w:val="center"/>
       </w:pPr>
       <w:r>
@@ -13334,128 +13265,59 @@
           <w:sz w:val="28"/>
           <w:szCs w:val="28"/>
         </w:rPr>
-        <w:t xml:space="preserve">Рисунок 1.18 – Діалог з AI: МНК через QR-розклад (промпт 6)</w:t>
+        <w:t xml:space="preserve">Рисунок 1.17 – Діалог з AI: промпт 1 – технічне завдання</w:t>
       </w:r>
     </w:p>
-    <w:tbl>
-      <w:tblPr>
-        <w:tblW w:type="dxa" w:w="9354"/>
-        <w:tblBorders>
-          <w:top w:val="single" w:color="auto" w:sz="4"/>
-          <w:left w:val="single" w:color="auto" w:sz="4"/>
-          <w:bottom w:val="single" w:color="auto" w:sz="4"/>
-          <w:right w:val="single" w:color="auto" w:sz="4"/>
-          <w:insideH w:val="single" w:color="auto" w:sz="4"/>
-          <w:insideV w:val="single" w:color="auto" w:sz="4"/>
-        </w:tblBorders>
-      </w:tblPr>
-      <w:tblGrid>
-        <w:gridCol w:w="9354"/>
-      </w:tblGrid>
-      <w:tr>
-        <w:tc>
-          <w:tcPr>
-            <w:tcW w:type="dxa" w:w="9354"/>
-            <w:tcBorders>
-              <w:top w:val="dashed" w:color="888888" w:sz="6"/>
-              <w:left w:val="dashed" w:color="888888" w:sz="6"/>
-              <w:bottom w:val="dashed" w:color="888888" w:sz="6"/>
-              <w:right w:val="dashed" w:color="888888" w:sz="6"/>
-            </w:tcBorders>
-            <w:tcMar>
-              <w:top w:type="dxa" w:w="600"/>
-              <w:left w:type="dxa" w:w="200"/>
-              <w:bottom w:type="dxa" w:w="600"/>
-              <w:right w:type="dxa" w:w="200"/>
-            </w:tcMar>
-          </w:tcPr>
-          <w:p>
-            <w:pPr>
-              <w:jc w:val="center"/>
-            </w:pPr>
-            <w:r>
-              <w:rPr>
-                <w:rFonts w:ascii="Times New Roman" w:cs="Times New Roman" w:eastAsia="Times New Roman" w:hAnsi="Times New Roman"/>
-                <w:i/>
-                <w:iCs/>
-                <w:color w:val="666666"/>
-                <w:sz w:val="24"/>
-                <w:szCs w:val="24"/>
-              </w:rPr>
-              <w:t xml:space="preserve">Місце для скріншоту: відповідь на промпт 9 – анімації</w:t>
-            </w:r>
-          </w:p>
-        </w:tc>
-      </w:tr>
-    </w:tbl>
     <w:p>
       <w:pPr>
-        <w:spacing w:after="160" w:before="60" w:line="276"/>
+        <w:keepNext/>
+        <w:spacing w:after="60" w:before="120"/>
         <w:jc w:val="center"/>
       </w:pPr>
       <w:r>
-        <w:rPr>
-          <w:rFonts w:ascii="Times New Roman" w:cs="Times New Roman" w:eastAsia="Times New Roman" w:hAnsi="Times New Roman"/>
-          <w:sz w:val="28"/>
-          <w:szCs w:val="28"/>
-        </w:rPr>
-        <w:t xml:space="preserve">Рисунок 1.19 – Діалог з AI: анімації, відповідь російською мовою (промпт 9)</w:t>
+        <w:drawing>
+          <wp:inline distT="0" distB="0" distL="0" distR="0">
+            <wp:extent cx="5905500" cy="2276475"/>
+            <wp:effectExtent t="0" r="0" b="0" l="0"/>
+            <wp:docPr id="18" name="" descr="" title=""/>
+            <wp:cNvGraphicFramePr>
+              <a:graphicFrameLocks xmlns:a="http://schemas.openxmlformats.org/drawingml/2006/main" noChangeAspect="1"/>
+            </wp:cNvGraphicFramePr>
+            <a:graphic xmlns:a="http://schemas.openxmlformats.org/drawingml/2006/main">
+              <a:graphicData uri="http://schemas.openxmlformats.org/drawingml/2006/picture">
+                <pic:pic xmlns:pic="http://schemas.openxmlformats.org/drawingml/2006/picture">
+                  <pic:nvPicPr>
+                    <pic:cNvPr id="0" name="" descr=""/>
+                    <pic:cNvPicPr>
+                      <a:picLocks noChangeAspect="1" noChangeArrowheads="1"/>
+                    </pic:cNvPicPr>
+                  </pic:nvPicPr>
+                  <pic:blipFill>
+                    <a:blip r:embed="rId26" cstate="none"/>
+                    <a:srcRect/>
+                    <a:stretch>
+                      <a:fillRect/>
+                    </a:stretch>
+                  </pic:blipFill>
+                  <pic:spPr bwMode="auto">
+                    <a:xfrm>
+                      <a:off x="0" y="0"/>
+                      <a:ext cx="5905500" cy="2276475"/>
+                    </a:xfrm>
+                    <a:prstGeom prst="rect">
+                      <a:avLst/>
+                    </a:prstGeom>
+                  </pic:spPr>
+                </pic:pic>
+              </a:graphicData>
+            </a:graphic>
+          </wp:inline>
+        </w:drawing>
       </w:r>
     </w:p>
-    <w:tbl>
-      <w:tblPr>
-        <w:tblW w:type="dxa" w:w="9354"/>
-        <w:tblBorders>
-          <w:top w:val="single" w:color="auto" w:sz="4"/>
-          <w:left w:val="single" w:color="auto" w:sz="4"/>
-          <w:bottom w:val="single" w:color="auto" w:sz="4"/>
-          <w:right w:val="single" w:color="auto" w:sz="4"/>
-          <w:insideH w:val="single" w:color="auto" w:sz="4"/>
-          <w:insideV w:val="single" w:color="auto" w:sz="4"/>
-        </w:tblBorders>
-      </w:tblPr>
-      <w:tblGrid>
-        <w:gridCol w:w="9354"/>
-      </w:tblGrid>
-      <w:tr>
-        <w:tc>
-          <w:tcPr>
-            <w:tcW w:type="dxa" w:w="9354"/>
-            <w:tcBorders>
-              <w:top w:val="dashed" w:color="888888" w:sz="6"/>
-              <w:left w:val="dashed" w:color="888888" w:sz="6"/>
-              <w:bottom w:val="dashed" w:color="888888" w:sz="6"/>
-              <w:right w:val="dashed" w:color="888888" w:sz="6"/>
-            </w:tcBorders>
-            <w:tcMar>
-              <w:top w:type="dxa" w:w="600"/>
-              <w:left w:type="dxa" w:w="200"/>
-              <w:bottom w:type="dxa" w:w="600"/>
-              <w:right w:type="dxa" w:w="200"/>
-            </w:tcMar>
-          </w:tcPr>
-          <w:p>
-            <w:pPr>
-              <w:jc w:val="center"/>
-            </w:pPr>
-            <w:r>
-              <w:rPr>
-                <w:rFonts w:ascii="Times New Roman" w:cs="Times New Roman" w:eastAsia="Times New Roman" w:hAnsi="Times New Roman"/>
-                <w:i/>
-                <w:iCs/>
-                <w:color w:val="666666"/>
-                <w:sz w:val="24"/>
-                <w:szCs w:val="24"/>
-              </w:rPr>
-              <w:t xml:space="preserve">Місце для скріншоту: відповідь на промпт 12 – таблиця «Серйозні вади»</w:t>
-            </w:r>
-          </w:p>
-        </w:tc>
-      </w:tr>
-    </w:tbl>
     <w:p>
       <w:pPr>
-        <w:spacing w:after="160" w:before="60" w:line="276"/>
+        <w:spacing w:after="160" w:line="276"/>
         <w:jc w:val="center"/>
       </w:pPr>
       <w:r>
@@ -13464,7 +13326,129 @@
           <w:sz w:val="28"/>
           <w:szCs w:val="28"/>
         </w:rPr>
-        <w:t xml:space="preserve">Рисунок 1.20 – Діалог з AI: результати критичної перевірки коду (промпт 12)</w:t>
+        <w:t xml:space="preserve">Рисунок 1.18 – Діалог з AI: промпт 2 – вибір методології</w:t>
+      </w:r>
+    </w:p>
+    <w:p>
+      <w:pPr>
+        <w:keepNext/>
+        <w:spacing w:after="60" w:before="120"/>
+        <w:jc w:val="center"/>
+      </w:pPr>
+      <w:r>
+        <w:drawing>
+          <wp:inline distT="0" distB="0" distL="0" distR="0">
+            <wp:extent cx="5905500" cy="3476625"/>
+            <wp:effectExtent t="0" r="0" b="0" l="0"/>
+            <wp:docPr id="19" name="" descr="" title=""/>
+            <wp:cNvGraphicFramePr>
+              <a:graphicFrameLocks xmlns:a="http://schemas.openxmlformats.org/drawingml/2006/main" noChangeAspect="1"/>
+            </wp:cNvGraphicFramePr>
+            <a:graphic xmlns:a="http://schemas.openxmlformats.org/drawingml/2006/main">
+              <a:graphicData uri="http://schemas.openxmlformats.org/drawingml/2006/picture">
+                <pic:pic xmlns:pic="http://schemas.openxmlformats.org/drawingml/2006/picture">
+                  <pic:nvPicPr>
+                    <pic:cNvPr id="0" name="" descr=""/>
+                    <pic:cNvPicPr>
+                      <a:picLocks noChangeAspect="1" noChangeArrowheads="1"/>
+                    </pic:cNvPicPr>
+                  </pic:nvPicPr>
+                  <pic:blipFill>
+                    <a:blip r:embed="rId27" cstate="none"/>
+                    <a:srcRect/>
+                    <a:stretch>
+                      <a:fillRect/>
+                    </a:stretch>
+                  </pic:blipFill>
+                  <pic:spPr bwMode="auto">
+                    <a:xfrm>
+                      <a:off x="0" y="0"/>
+                      <a:ext cx="5905500" cy="3476625"/>
+                    </a:xfrm>
+                    <a:prstGeom prst="rect">
+                      <a:avLst/>
+                    </a:prstGeom>
+                  </pic:spPr>
+                </pic:pic>
+              </a:graphicData>
+            </a:graphic>
+          </wp:inline>
+        </w:drawing>
+      </w:r>
+    </w:p>
+    <w:p>
+      <w:pPr>
+        <w:spacing w:after="160" w:line="276"/>
+        <w:jc w:val="center"/>
+      </w:pPr>
+      <w:r>
+        <w:rPr>
+          <w:rFonts w:ascii="Times New Roman" w:cs="Times New Roman" w:eastAsia="Times New Roman" w:hAnsi="Times New Roman"/>
+          <w:sz w:val="28"/>
+          <w:szCs w:val="28"/>
+        </w:rPr>
+        <w:t xml:space="preserve">Рисунок 1.19 – Діалог з AI: промпт 4 – структура проєкту і перевірка в браузері</w:t>
+      </w:r>
+    </w:p>
+    <w:p>
+      <w:pPr>
+        <w:keepNext/>
+        <w:spacing w:after="60" w:before="120"/>
+        <w:jc w:val="center"/>
+      </w:pPr>
+      <w:r>
+        <w:drawing>
+          <wp:inline distT="0" distB="0" distL="0" distR="0">
+            <wp:extent cx="5905500" cy="2990850"/>
+            <wp:effectExtent t="0" r="0" b="0" l="0"/>
+            <wp:docPr id="20" name="" descr="" title=""/>
+            <wp:cNvGraphicFramePr>
+              <a:graphicFrameLocks xmlns:a="http://schemas.openxmlformats.org/drawingml/2006/main" noChangeAspect="1"/>
+            </wp:cNvGraphicFramePr>
+            <a:graphic xmlns:a="http://schemas.openxmlformats.org/drawingml/2006/main">
+              <a:graphicData uri="http://schemas.openxmlformats.org/drawingml/2006/picture">
+                <pic:pic xmlns:pic="http://schemas.openxmlformats.org/drawingml/2006/picture">
+                  <pic:nvPicPr>
+                    <pic:cNvPr id="0" name="" descr=""/>
+                    <pic:cNvPicPr>
+                      <a:picLocks noChangeAspect="1" noChangeArrowheads="1"/>
+                    </pic:cNvPicPr>
+                  </pic:nvPicPr>
+                  <pic:blipFill>
+                    <a:blip r:embed="rId28" cstate="none"/>
+                    <a:srcRect/>
+                    <a:stretch>
+                      <a:fillRect/>
+                    </a:stretch>
+                  </pic:blipFill>
+                  <pic:spPr bwMode="auto">
+                    <a:xfrm>
+                      <a:off x="0" y="0"/>
+                      <a:ext cx="5905500" cy="2990850"/>
+                    </a:xfrm>
+                    <a:prstGeom prst="rect">
+                      <a:avLst/>
+                    </a:prstGeom>
+                  </pic:spPr>
+                </pic:pic>
+              </a:graphicData>
+            </a:graphic>
+          </wp:inline>
+        </w:drawing>
+      </w:r>
+    </w:p>
+    <w:p>
+      <w:pPr>
+        <w:spacing w:after="160" w:line="276"/>
+        <w:jc w:val="center"/>
+      </w:pPr>
+      <w:r>
+        <w:rPr>
+          <w:rFonts w:ascii="Times New Roman" w:cs="Times New Roman" w:eastAsia="Times New Roman" w:hAnsi="Times New Roman"/>
+          <w:sz w:val="28"/>
+          <w:szCs w:val="28"/>
+        </w:rPr>
+        <w:t xml:space="preserve">Рисунок 1.20 – Діалог з AI: промпт 5 – Лагранж і Ньютон, похибки у вузлах</w:t>
       </w:r>
     </w:p>
     <w:p>

</xml_diff>

<commit_message>
docs: fix title page layout in the report
</commit_message>
<xml_diff>
--- a/docs/report/ЛР1_Заяць_ІПЗ-1.docx
+++ b/docs/report/ЛР1_Заяць_ІПЗ-1.docx
@@ -4,7 +4,7 @@
   <w:body>
     <w:p>
       <w:pPr>
-        <w:spacing w:line="360"/>
+        <w:spacing w:after="0" w:before="0" w:line="360"/>
         <w:jc w:val="center"/>
       </w:pPr>
       <w:r>
@@ -18,7 +18,7 @@
     </w:p>
     <w:p>
       <w:pPr>
-        <w:spacing w:line="360"/>
+        <w:spacing w:after="0" w:before="0" w:line="360"/>
         <w:jc w:val="center"/>
       </w:pPr>
       <w:r>
@@ -32,7 +32,7 @@
     </w:p>
     <w:p>
       <w:pPr>
-        <w:spacing w:line="360"/>
+        <w:spacing w:after="0" w:before="0" w:line="360"/>
         <w:jc w:val="center"/>
       </w:pPr>
       <w:r>
@@ -46,7 +46,7 @@
     </w:p>
     <w:p>
       <w:pPr>
-        <w:spacing w:line="360"/>
+        <w:spacing w:after="0" w:before="0" w:line="360"/>
         <w:jc w:val="center"/>
       </w:pPr>
       <w:r>
@@ -60,7 +60,7 @@
     </w:p>
     <w:p>
       <w:pPr>
-        <w:spacing w:line="360"/>
+        <w:spacing w:after="0" w:before="0" w:line="360"/>
         <w:jc w:val="center"/>
       </w:pPr>
       <w:r>
@@ -74,228 +74,119 @@
     </w:p>
     <w:p>
       <w:pPr>
-        <w:spacing w:line="360"/>
+        <w:spacing w:after="0" w:before="3000" w:line="360"/>
+        <w:jc w:val="center"/>
       </w:pPr>
+      <w:r>
+        <w:rPr>
+          <w:rFonts w:ascii="Times New Roman" w:cs="Times New Roman" w:eastAsia="Times New Roman" w:hAnsi="Times New Roman"/>
+          <w:sz w:val="28"/>
+          <w:szCs w:val="28"/>
+        </w:rPr>
+        <w:t xml:space="preserve">Лабораторна робота № 1</w:t>
+      </w:r>
     </w:p>
     <w:p>
       <w:pPr>
-        <w:spacing w:line="360"/>
+        <w:spacing w:after="0" w:before="0" w:line="360"/>
+        <w:jc w:val="center"/>
       </w:pPr>
+      <w:r>
+        <w:rPr>
+          <w:rFonts w:ascii="Times New Roman" w:cs="Times New Roman" w:eastAsia="Times New Roman" w:hAnsi="Times New Roman"/>
+          <w:sz w:val="28"/>
+          <w:szCs w:val="28"/>
+        </w:rPr>
+        <w:t xml:space="preserve">Тема: Апроксимація функцій методами інтерполяції та МНК</w:t>
+      </w:r>
     </w:p>
     <w:p>
       <w:pPr>
-        <w:spacing w:line="360"/>
+        <w:spacing w:after="0" w:before="2200" w:line="360"/>
+        <w:ind w:left="5103"/>
       </w:pPr>
+      <w:r>
+        <w:rPr>
+          <w:rFonts w:ascii="Times New Roman" w:cs="Times New Roman" w:eastAsia="Times New Roman" w:hAnsi="Times New Roman"/>
+          <w:sz w:val="28"/>
+          <w:szCs w:val="28"/>
+        </w:rPr>
+        <w:t xml:space="preserve">Виконав:</w:t>
+      </w:r>
     </w:p>
     <w:p>
       <w:pPr>
-        <w:spacing w:line="360"/>
+        <w:spacing w:after="0" w:before="0" w:line="360"/>
+        <w:ind w:left="5103"/>
       </w:pPr>
+      <w:r>
+        <w:rPr>
+          <w:rFonts w:ascii="Times New Roman" w:cs="Times New Roman" w:eastAsia="Times New Roman" w:hAnsi="Times New Roman"/>
+          <w:sz w:val="28"/>
+          <w:szCs w:val="28"/>
+        </w:rPr>
+        <w:t xml:space="preserve">студент 4-го курсу</w:t>
+      </w:r>
     </w:p>
     <w:p>
       <w:pPr>
-        <w:spacing w:line="360"/>
+        <w:spacing w:after="0" w:before="0" w:line="360"/>
+        <w:ind w:left="5103"/>
       </w:pPr>
+      <w:r>
+        <w:rPr>
+          <w:rFonts w:ascii="Times New Roman" w:cs="Times New Roman" w:eastAsia="Times New Roman" w:hAnsi="Times New Roman"/>
+          <w:sz w:val="28"/>
+          <w:szCs w:val="28"/>
+        </w:rPr>
+        <w:t xml:space="preserve">денної форми навчання</w:t>
+      </w:r>
     </w:p>
     <w:p>
       <w:pPr>
-        <w:spacing w:line="360"/>
+        <w:spacing w:after="0" w:before="0" w:line="360"/>
+        <w:ind w:left="5103"/>
       </w:pPr>
+      <w:r>
+        <w:rPr>
+          <w:rFonts w:ascii="Times New Roman" w:cs="Times New Roman" w:eastAsia="Times New Roman" w:hAnsi="Times New Roman"/>
+          <w:sz w:val="28"/>
+          <w:szCs w:val="28"/>
+        </w:rPr>
+        <w:t xml:space="preserve">групи ІПЗ-1</w:t>
+      </w:r>
     </w:p>
     <w:p>
       <w:pPr>
-        <w:spacing w:line="360"/>
+        <w:spacing w:after="0" w:before="0" w:line="360"/>
+        <w:ind w:left="5103"/>
       </w:pPr>
+      <w:r>
+        <w:rPr>
+          <w:rFonts w:ascii="Times New Roman" w:cs="Times New Roman" w:eastAsia="Times New Roman" w:hAnsi="Times New Roman"/>
+          <w:sz w:val="28"/>
+          <w:szCs w:val="28"/>
+        </w:rPr>
+        <w:t xml:space="preserve">Заяць Дмитро Ігорович</w:t>
+      </w:r>
     </w:p>
     <w:p>
       <w:pPr>
-        <w:spacing w:line="360"/>
+        <w:spacing w:after="0" w:before="2200" w:line="360"/>
+        <w:jc w:val="center"/>
       </w:pPr>
+      <w:r>
+        <w:rPr>
+          <w:rFonts w:ascii="Times New Roman" w:cs="Times New Roman" w:eastAsia="Times New Roman" w:hAnsi="Times New Roman"/>
+          <w:sz w:val="28"/>
+          <w:szCs w:val="28"/>
+        </w:rPr>
+        <w:t xml:space="preserve">Ужгород – 2026</w:t>
+      </w:r>
     </w:p>
     <w:p>
       <w:pPr>
-        <w:spacing w:line="360"/>
-        <w:jc w:val="center"/>
-      </w:pPr>
-      <w:r>
-        <w:rPr>
-          <w:rFonts w:ascii="Times New Roman" w:cs="Times New Roman" w:eastAsia="Times New Roman" w:hAnsi="Times New Roman"/>
-          <w:sz w:val="28"/>
-          <w:szCs w:val="28"/>
-        </w:rPr>
-        <w:t xml:space="preserve">Лабораторна робота № 1</w:t>
-      </w:r>
-    </w:p>
-    <w:p>
-      <w:pPr>
-        <w:spacing w:line="360"/>
-        <w:jc w:val="center"/>
-      </w:pPr>
-      <w:r>
-        <w:rPr>
-          <w:rFonts w:ascii="Times New Roman" w:cs="Times New Roman" w:eastAsia="Times New Roman" w:hAnsi="Times New Roman"/>
-          <w:sz w:val="28"/>
-          <w:szCs w:val="28"/>
-        </w:rPr>
-        <w:t xml:space="preserve">Тема: Апроксимація функцій методами інтерполяції та МНК</w:t>
-      </w:r>
-    </w:p>
-    <w:p>
-      <w:pPr>
-        <w:spacing w:line="360"/>
-      </w:pPr>
-    </w:p>
-    <w:p>
-      <w:pPr>
-        <w:spacing w:line="360"/>
-      </w:pPr>
-    </w:p>
-    <w:p>
-      <w:pPr>
-        <w:spacing w:line="360"/>
-      </w:pPr>
-    </w:p>
-    <w:p>
-      <w:pPr>
-        <w:spacing w:line="360"/>
-      </w:pPr>
-    </w:p>
-    <w:p>
-      <w:pPr>
-        <w:spacing w:line="360"/>
-      </w:pPr>
-    </w:p>
-    <w:p>
-      <w:pPr>
-        <w:spacing w:line="360"/>
-      </w:pPr>
-    </w:p>
-    <w:p>
-      <w:pPr>
-        <w:spacing w:line="360"/>
-        <w:ind w:left="5103"/>
-      </w:pPr>
-      <w:r>
-        <w:rPr>
-          <w:rFonts w:ascii="Times New Roman" w:cs="Times New Roman" w:eastAsia="Times New Roman" w:hAnsi="Times New Roman"/>
-          <w:sz w:val="28"/>
-          <w:szCs w:val="28"/>
-        </w:rPr>
-        <w:t xml:space="preserve">Виконав:</w:t>
-      </w:r>
-    </w:p>
-    <w:p>
-      <w:pPr>
-        <w:spacing w:line="360"/>
-        <w:ind w:left="5103"/>
-      </w:pPr>
-      <w:r>
-        <w:rPr>
-          <w:rFonts w:ascii="Times New Roman" w:cs="Times New Roman" w:eastAsia="Times New Roman" w:hAnsi="Times New Roman"/>
-          <w:sz w:val="28"/>
-          <w:szCs w:val="28"/>
-        </w:rPr>
-        <w:t xml:space="preserve">студент 4-го курсу</w:t>
-      </w:r>
-    </w:p>
-    <w:p>
-      <w:pPr>
-        <w:spacing w:line="360"/>
-        <w:ind w:left="5103"/>
-      </w:pPr>
-      <w:r>
-        <w:rPr>
-          <w:rFonts w:ascii="Times New Roman" w:cs="Times New Roman" w:eastAsia="Times New Roman" w:hAnsi="Times New Roman"/>
-          <w:sz w:val="28"/>
-          <w:szCs w:val="28"/>
-        </w:rPr>
-        <w:t xml:space="preserve">денної форми навчання</w:t>
-      </w:r>
-    </w:p>
-    <w:p>
-      <w:pPr>
-        <w:spacing w:line="360"/>
-        <w:ind w:left="5103"/>
-      </w:pPr>
-      <w:r>
-        <w:rPr>
-          <w:rFonts w:ascii="Times New Roman" w:cs="Times New Roman" w:eastAsia="Times New Roman" w:hAnsi="Times New Roman"/>
-          <w:sz w:val="28"/>
-          <w:szCs w:val="28"/>
-        </w:rPr>
-        <w:t xml:space="preserve">групи ІПЗ-1</w:t>
-      </w:r>
-    </w:p>
-    <w:p>
-      <w:pPr>
-        <w:spacing w:line="360"/>
-        <w:ind w:left="5103"/>
-      </w:pPr>
-      <w:r>
-        <w:rPr>
-          <w:rFonts w:ascii="Times New Roman" w:cs="Times New Roman" w:eastAsia="Times New Roman" w:hAnsi="Times New Roman"/>
-          <w:sz w:val="28"/>
-          <w:szCs w:val="28"/>
-        </w:rPr>
-        <w:t xml:space="preserve">Заяць Дмитро Ігорович</w:t>
-      </w:r>
-    </w:p>
-    <w:p>
-      <w:pPr>
-        <w:spacing w:line="360"/>
-      </w:pPr>
-    </w:p>
-    <w:p>
-      <w:pPr>
-        <w:spacing w:line="360"/>
-      </w:pPr>
-    </w:p>
-    <w:p>
-      <w:pPr>
-        <w:spacing w:line="360"/>
-      </w:pPr>
-    </w:p>
-    <w:p>
-      <w:pPr>
-        <w:spacing w:line="360"/>
-      </w:pPr>
-    </w:p>
-    <w:p>
-      <w:pPr>
-        <w:spacing w:line="360"/>
-      </w:pPr>
-    </w:p>
-    <w:p>
-      <w:pPr>
-        <w:spacing w:line="360"/>
-      </w:pPr>
-    </w:p>
-    <w:p>
-      <w:pPr>
-        <w:spacing w:line="360"/>
-      </w:pPr>
-    </w:p>
-    <w:p>
-      <w:pPr>
-        <w:spacing w:line="360"/>
-        <w:jc w:val="center"/>
-      </w:pPr>
-      <w:r>
-        <w:rPr>
-          <w:rFonts w:ascii="Times New Roman" w:cs="Times New Roman" w:eastAsia="Times New Roman" w:hAnsi="Times New Roman"/>
-          <w:sz w:val="28"/>
-          <w:szCs w:val="28"/>
-        </w:rPr>
-        <w:t xml:space="preserve">Ужгород – 2026</w:t>
-      </w:r>
-    </w:p>
-    <w:p>
-      <w:r>
-        <w:br w:type="page"/>
-      </w:r>
-    </w:p>
-    <w:p>
-      <w:pPr>
+        <w:pageBreakBefore/>
         <w:spacing w:after="0" w:line="360"/>
         <w:ind w:firstLine="709"/>
         <w:jc w:val="both"/>

</xml_diff>